<commit_message>
docs(anatomy-linkedin): updated docx with full link set + real /anatomy screenshots
- LinkedIn post first-comment now includes szl-holdings mirror URLs
  (a11oy, amaru, conduit, sentra, vessels) and PR #34 link
- Added 6 real PNG/JPG captures of the live /anatomy viewer:
  hero, LiveOps panel (services/amaru polling), chakra sections
  root-solar and heart-crown, full-page overview, hero zoom
- All shots captured against the running app, no mockups.
</commit_message>
<xml_diff>
--- a/docs/anatomy-linkedin/a11oy_anatomy_linkedin_post.docx
+++ b/docs/anatomy-linkedin/a11oy_anatomy_linkedin_post.docx
@@ -426,7 +426,7 @@
         <w:rPr>
           <w:color w:val="1A1A1A"/>
         </w:rPr>
-        <w:t xml:space="preserve">FIRST COMMENT — 472 chars </w:t>
+        <w:t xml:space="preserve">FIRST COMMENT — 897 chars </w:t>
       </w:r>
     </w:p>
     <w:p>
@@ -445,6 +445,17 @@
         <w:t>• v13 release DOI: doi.org/10.5281/zenodo.20195368</w:t>
         <w:br/>
         <w:t>• Anatomy bundle index (per-figure metadata + sha256 list): docs/anatomy/INDEX.md and docs/anatomy/figures.sha256 in the repo above</w:t>
+        <w:br/>
+        <w:br/>
+        <w:t>A11oy viewer + the operational stack behind it (all SZL Holdings org):</w:t>
+        <w:br/>
+        <w:t>• A11oy viewer (front-end + vendored bundle): github.com/szl-holdings/a11oy</w:t>
+        <w:br/>
+        <w:t>• LinkedIn post drop (PR with .docx + screenshots): github.com/szl-holdings/a11oy/pull/34</w:t>
+        <w:br/>
+        <w:t>• services/amaru (the read-only LiveOps endpoints the viewer polls): github.com/szl-holdings/amaru</w:t>
+        <w:br/>
+        <w:t>• Conduit / Sentra / Vessels surfaces: github.com/szl-holdings/{conduit,sentra,vessels}</w:t>
         <w:br/>
         <w:br/>
         <w:t>Happy to walk through the in-browser integrity check construction if anyone wants the 30-line walkthrough.</w:t>

</xml_diff>